<commit_message>
court(iowa): petition for rehearing gated on the shared model, empty signature lines and hard breaks landed (fb-595.54.44)
Co-Authored-By: Claude Opus 5.5 <noreply@anthropic.com>
</commit_message>
<xml_diff>
--- a/courts/eighth-circuit/iowa/state/supreme-court/petition-for-rehearing/usage/OUTPUT-petition-for-rehearing.docx
+++ b/courts/eighth-circuit/iowa/state/supreme-court/petition-for-rehearing/usage/OUTPUT-petition-for-rehearing.docx
@@ -5730,8 +5730,6 @@
         <w:rPr>
           <w:b/>
           <w:bCs/>
-          <w:i/>
-          <w:iCs/>
         </w:rPr>
         <w:t xml:space="preserve">PPH</w:t>
       </w:r>
@@ -5739,17 +5737,13 @@
         <w:rPr>
           <w:b/>
           <w:bCs/>
-          <w:i/>
-          <w:iCs/>
-        </w:rPr>
-        <w:t xml:space="preserve"> </w:t>
-      </w:r>
-      <w:r>
-        <w:rPr>
-          <w:b/>
-          <w:bCs/>
-          <w:i/>
-          <w:iCs/>
+        </w:rPr>
+        <w:t xml:space="preserve"> </w:t>
+      </w:r>
+      <w:r>
+        <w:rPr>
+          <w:b/>
+          <w:bCs/>
         </w:rPr>
         <w:t xml:space="preserve">2022</w:t>
       </w:r>
@@ -6422,7 +6416,7 @@
         <w:pStyle w:val="BodyText"/>
       </w:pPr>
       <w:r>
-        <w:t xml:space="preserve">Plaintiffs requested that, even if this Court changed the applicable standard to rational basis review, it leave the temporary injunction in place while the district court passes on the Ban’s constitutionality under the new standard in the first instance. Petitioners-Appellees’ Final Br. at 41–43; Oral Argument Audio at 34:40, available at https://​www.​youtube.​com/​watch?v=7YATx9F0qGQ. As counsel explained at oral argument, this would permit the development of factual evidence to show why the Ban does not survive rational basis review, particularly due to the limited scope of the Ban’s exceptions.</w:t>
+        <w:t xml:space="preserve">Plaintiffs requested that, even if this Court changed the applicable standard to rational basis review, it leave the temporary injunction in place while the district court passes on the Ban’s constitutionality under the new standard in the first instance. Petitioners-Appellees’ Final Br. at 41–43; Oral Argument Audio at 34:40, available at https://​www.​youtube.​com/​watch?​v=7YATx9F0qGQ. As counsel explained at oral argument, this would permit the development of factual evidence to show why the Ban does not survive rational basis review, particularly due to the limited scope of the Ban’s exceptions.</w:t>
       </w:r>
     </w:p>
     <w:p>
@@ -6471,7 +6465,7 @@
         <w:t xml:space="preserve"> </w:t>
       </w:r>
       <w:r>
-        <w:t xml:space="preserve">557–58 (Iowa 2015) (holding, in an opinion clarifying the standard with respect to sentencing of juveniles, because “the district court did not have the benefit of this decision setting forth the factors the court must use, . . . the proper remedy is to remand the case back to the district court to consider the matter consistent with our holding in this opinion.”),</w:t>
+        <w:t xml:space="preserve">557–58 (Iowa 2015) (holding, in an opinion clarifying the standard with respect to sentencing of juveniles, because “the district court did not have the benefit of this decision setting forth the factors the court must use, . . . the proper remedy is to remand the case back to the district court to consider the matter consistent with our holding in this opinion.”),</w:t>
       </w:r>
       <w:r>
         <w:t xml:space="preserve"> </w:t>
@@ -6542,7 +6536,7 @@
         <w:t xml:space="preserve"> </w:t>
       </w:r>
       <w:r>
-        <w:t xml:space="preserve">95 (Iowa 1985) (“A temporary injunction is a preventive remedy to maintain the status quo of the parties prior to final judgment . . . .”). Doing so would also promote judicial economy, eliminating the need for piecemeal litigation or interlocutory appeals with respect to the exceptions.</w:t>
+        <w:t xml:space="preserve">95 (Iowa 1985) (“A temporary injunction is a preventive remedy to maintain the status quo of the parties prior to final judgment . . . .”). Doing so would also promote judicial economy, eliminating the need for piecemeal litigation or interlocutory appeals with respect to the exceptions.</w:t>
       </w:r>
     </w:p>
     <w:p>
@@ -9300,6 +9294,33 @@
       <w:ind w:left="2160" w:hanging="720"/>
     </w:pPr>
   </w:style>
+  <w:style w:type="paragraph" w:customStyle="1" w:styleId="XdQuoteList1">
+    <w:name w:val="Xd Quote List 1"/>
+    <w:basedOn w:val="Normal"/>
+    <w:qFormat/>
+    <w:pPr>
+      <w:spacing w:before="0" w:after="0" w:line="322" w:lineRule="exact"/>
+      <w:ind w:left="1440" w:right="720" w:hanging="720"/>
+    </w:pPr>
+  </w:style>
+  <w:style w:type="paragraph" w:customStyle="1" w:styleId="XdQuoteList2">
+    <w:name w:val="Xd Quote List 2"/>
+    <w:basedOn w:val="Normal"/>
+    <w:qFormat/>
+    <w:pPr>
+      <w:spacing w:before="0" w:after="0" w:line="322" w:lineRule="exact"/>
+      <w:ind w:left="2160" w:right="720" w:hanging="720"/>
+    </w:pPr>
+  </w:style>
+  <w:style w:type="paragraph" w:customStyle="1" w:styleId="XdQuoteList3">
+    <w:name w:val="Xd Quote List 3"/>
+    <w:basedOn w:val="Normal"/>
+    <w:qFormat/>
+    <w:pPr>
+      <w:spacing w:before="0" w:after="0" w:line="322" w:lineRule="exact"/>
+      <w:ind w:left="2880" w:right="720" w:hanging="720"/>
+    </w:pPr>
+  </w:style>
   <w:style w:type="paragraph" w:customStyle="1" w:styleId="XdTail">
     <w:name w:val="XdTail"/>
     <w:basedOn w:val="BodyText"/>

</xml_diff>